<commit_message>
Redraw Figure 1.9 on an equilateral triangle with a round window
The trilemma is now drawn on an equilateral triangle. Its corners are
discs tinted with their material from the illustration palette, steel,
copper and coolant, each with a clearer drawing of what it governs: the
sleeved rotor, a waveform whose frequency rises, a thermometer. The
feasible window is a circle at the centre, so the composition balances,
and the two paradigms inside it are set in three short lines each. The
gatekeeper band and the colours of Figure 1.6 stay.

House_Style.md section 5 names the material tints for diagram elements
and the new pictograms; the chapter, the stamped copy and the guide are
rebuilt.

Co-Authored-By: Claude Opus 5.5 <noreply@anthropic.com>
Claude-Session: https://claude.ai/code/session_01YTsySEafbpGxYLQMAGUGjT
</commit_message>
<xml_diff>
--- a/chapter1/Chapter_1_house_style.docx
+++ b/chapter1/Chapter_1_house_style.docx
@@ -14621,7 +14621,7 @@
         </w:rPr>
         <w:drawing>
           <wp:inline distT="0" distB="0" distL="0" distR="0" wp14:anchorId="22F4EC17" wp14:editId="705E4728">
-            <wp:extent cx="5731510" cy="4050165"/>
+            <wp:extent cx="5731510" cy="4266621"/>
             <wp:effectExtent l="0" t="0" r="0" b="0"/>
             <wp:docPr id="710352468" name="Picture 4" descr="The high-speed trilemma. Mechanical integrity, electromagnetic efficiency and thermal management pull against one another along every edge of the triangle, and feasible high-speed designs occupy the compromise window at its centre. As Section 1.6.1 notes, the power electronic interface acts as the gatekeeper that decides which part of that window can be reached at all."/>
             <wp:cNvGraphicFramePr>
@@ -14649,7 +14649,7 @@
                   <pic:spPr>
                     <a:xfrm>
                       <a:off x="0" y="0"/>
-                      <a:ext cx="5731510" cy="4050165"/>
+                      <a:ext cx="5731510" cy="4266621"/>
                     </a:xfrm>
                     <a:prstGeom prst="rect">
                       <a:avLst/>

</xml_diff>

<commit_message>
Draw the gatekeeper of Figure 1.9 as a gate
The power electronics now stands across the feasible window as a gate:
a post, an arm striped in the blue of the converter, and the sign
"power electronics: the gatekeeper". Above it is the two-pole industrial
machine at 500 Hz, which silicon IGBTs can supply; below it the six-pole
mobile machine at 1500 Hz, which needs SiC or GaN, both at 30 000 r/min,
so the frequencies say why the gate stands where it does. The window is
larger, 3.1 cm in radius, and the outer cycle is unchanged.

The caption's last sentence describes the gate and the two machines,
with no-break spaces in the quantities, as does the Figure 1.2 caption.
House_Style.md notes that a metaphor the text uses is worth drawing.

Co-Authored-By: Claude Opus 5.5 <noreply@anthropic.com>
Claude-Session: https://claude.ai/code/session_01YTsySEafbpGxYLQMAGUGjT
</commit_message>
<xml_diff>
--- a/chapter1/Chapter_1_house_style.docx
+++ b/chapter1/Chapter_1_house_style.docx
@@ -2965,7 +2965,7 @@
           <wp:inline distT="0" distB="0" distL="0" distR="0" wp14:anchorId="7AD894E6" wp14:editId="0B319140">
             <wp:extent cx="5731510" cy="6030280"/>
             <wp:effectExtent l="0" t="0" r="0" b="0"/>
-            <wp:docPr id="169046035" name="Picture 1" descr="Traditional geared and integrated direct-drive architectures. (a) a mains-frequency motor drives the impeller through a step-up gearbox having a heavy lubrication system. (b) the impeller is mounted directly on the high-speed motor shaft, optionally carried on active magnetic bearings (AMBs), and the gearbox, couplings and oil system disappear. The units are drawn to scale for a compressor of about 300 kW: (a) and (b) at one scale, so that their sizes compare directly, and (c), the motor of (b) with its upper half in section, at twice that scale. The dimensions are representative of catalogue equipment, not those of a particular machine."/>
+            <wp:docPr id="169046035" name="Picture 1" descr="Traditional geared and integrated direct-drive architectures. (a) a mains-frequency motor drives the impeller through a step-up gearbox having a heavy lubrication system. (b) the impeller is mounted directly on the high-speed motor shaft, optionally carried on active magnetic bearings (AMBs), and the gearbox, couplings and oil system disappear. The units are drawn to scale for a compressor of about 300 kW: (a) and (b) at one scale, so that their sizes compare directly, and (c), the motor of (b) with its upper half in section, at twice that scale. The dimensions are representative of catalogue equipment, not those of a particular machine."/>
             <wp:cNvGraphicFramePr>
               <a:graphicFrameLocks xmlns:a="http://schemas.openxmlformats.org/drawingml/2006/main" noChangeAspect="1"/>
             </wp:cNvGraphicFramePr>
@@ -3068,7 +3068,7 @@
           <w:rFonts w:ascii="Times New Roman" w:hAnsi="Times New Roman" w:cs="Times New Roman"/>
           <w:lang w:val="en-GB"/>
         </w:rPr>
-        <w:t xml:space="preserve"> The units are drawn to scale for a compressor of about 300 kW: (a) and (b) at one scale, so that their sizes compare directly, and (c), the motor of (b) with its upper half in section, at twice that scale. The dimensions are representative of catalogue equipment, not those of a particular machine.</w:t>
+        <w:t xml:space="preserve"> The units are drawn to scale for a compressor of about 300 kW: (a) and (b) at one scale, so that their sizes compare directly, and (c), the motor of (b) with its upper half in section, at twice that scale. The dimensions are representative of catalogue equipment, not those of a particular machine.</w:t>
       </w:r>
     </w:p>
     <w:p>
@@ -14623,7 +14623,7 @@
           <wp:inline distT="0" distB="0" distL="0" distR="0" wp14:anchorId="22F4EC17" wp14:editId="705E4728">
             <wp:extent cx="5731510" cy="4457164"/>
             <wp:effectExtent l="0" t="0" r="0" b="0"/>
-            <wp:docPr id="710352468" name="Picture 4" descr="The high-speed trilemma. Mechanical integrity, electromagnetic efficiency and thermal management pull against one another around the cycle, each remedy creating the next problem, and feasible high-speed designs occupy the compromise window at the centre. As Section 1.6.1 notes, the power electronic interface acts as the gatekeeper that decides which part of that window can be reached at all. The rotors in the window show the pole numbers of the two paradigms: two poles for the industrial machine that silicon IGBTs can supply, six for the mobile machine that needs SiC or GaN."/>
+            <wp:docPr id="710352468" name="Picture 4" descr="The high-speed trilemma. Mechanical integrity, electromagnetic efficiency and thermal management pull against one another around the cycle, each remedy creating the next problem, and feasible high-speed designs occupy the compromise window at the centre. As Section 1.6.1 notes, the power electronic interface acts as the gatekeeper that decides which part of that window can be reached at all. Within the window the power electronics stands as a gate between the two paradigms, shown at 30 000 r/min: above it the two-pole industrial machine at 500 Hz, which silicon IGBTs can supply, and below it the six-pole mobile machine at 1500 Hz, which needs SiC or GaN."/>
             <wp:cNvGraphicFramePr>
               <a:graphicFrameLocks xmlns:a="http://schemas.openxmlformats.org/drawingml/2006/main" noChangeAspect="1"/>
             </wp:cNvGraphicFramePr>
@@ -14693,7 +14693,7 @@
           <w:rFonts w:ascii="Times New Roman" w:hAnsi="Times New Roman" w:cs="Times New Roman"/>
           <w:lang w:val="en-GB"/>
         </w:rPr>
-        <w:t xml:space="preserve"> The rotors in the window show the pole numbers of the two paradigms: two poles for the industrial machine that silicon IGBTs can supply, six for the mobile machine that needs SiC or GaN.</w:t>
+        <w:t xml:space="preserve"> Within the window the power electronics stands as a gate between the two paradigms, shown at 30 000 r/min: above it the two-pole industrial machine at 500 Hz, which silicon IGBTs can supply, and below it the six-pole mobile machine at 1500 Hz, which needs SiC or GaN.</w:t>
       </w:r>
     </w:p>
     <w:p>

</xml_diff>